<commit_message>
feat(certificados): sistema completo de certificados Minciencias 2024 - Todas las plantillas con membrete USB actualizadas - Nuevos templates: ERL, No Especializada, Formacion, Manual/Guia, Boletin - FormsImportModal + formsImporter para importar desde Microsoft Forms - Pagina de certificados actualizada con UI mejorada - Scripts de generacion, inspeccion y testing de templates
</commit_message>
<xml_diff>
--- a/Certificados/Avales/Aval-Capítulo.docx
+++ b/Certificados/Avales/Aval-Capítulo.docx
@@ -801,25 +801,7 @@
           <w:sz w:val="22"/>
           <w:szCs w:val="22"/>
         </w:rPr>
-        <w:t>Director de Conocimiento, Innovación y Apropiación Social</w:t>
-      </w:r>
-    </w:p>
-    <w:p>
-      <w:pPr>
-        <w:jc w:val="center"/>
-        <w:rPr>
-          <w:rFonts w:ascii="Roboto" w:hAnsi="Roboto"/>
-          <w:sz w:val="22"/>
-          <w:szCs w:val="22"/>
-        </w:rPr>
-      </w:pPr>
-      <w:r>
-        <w:rPr>
-          <w:rFonts w:ascii="Roboto" w:hAnsi="Roboto"/>
-          <w:sz w:val="22"/>
-          <w:szCs w:val="22"/>
-        </w:rPr>
-        <w:t>Vicerrectoría de Investigación, Extensión e Innovación</w:t>
+        <w:t>Vicerrector de Investigación, Extensión e Innovación</w:t>
       </w:r>
     </w:p>
     <w:p>

</xml_diff>